<commit_message>
Harden FBDG paper for publication
Implement SOTA Research Auditor findings, strengthen manuscript positioning and cell-width discussion, freeze reproducibility outputs and manifest, refresh generated paper exports, and add the publication-hardening audit.
</commit_message>
<xml_diff>
--- a/paper/fbdg.docx
+++ b/paper/fbdg.docx
@@ -4245,6 +4245,96 @@
         <w:t xml:space="preserve">)</w:t>
       </w:r>
       <w:r>
+        <w:t xml:space="preserve">. Dynamic cell-probe and Multiphase lower bounds provide an important neighboring lower-bound tradition</w:t>
+      </w:r>
+      <w:r>
+        <w:t xml:space="preserve"> </w:t>
+      </w:r>
+      <w:r>
+        <w:t xml:space="preserve">(</w:t>
+      </w:r>
+      <w:hyperlink w:anchor="ref-patrascu2010multiphase">
+        <w:r>
+          <w:rPr>
+            <w:rStyle w:val="Hyperlink"/>
+          </w:rPr>
+          <w:t xml:space="preserve">Pătraşcu 2010</w:t>
+        </w:r>
+      </w:hyperlink>
+      <w:r>
+        <w:t xml:space="preserve">;</w:t>
+      </w:r>
+      <w:r>
+        <w:t xml:space="preserve"> </w:t>
+      </w:r>
+      <w:hyperlink w:anchor="ref-larsen2020boolean">
+        <w:r>
+          <w:rPr>
+            <w:rStyle w:val="Hyperlink"/>
+          </w:rPr>
+          <w:t xml:space="preserve">Larsen, Weinstein, and Yu 2020</w:t>
+        </w:r>
+      </w:hyperlink>
+      <w:r>
+        <w:t xml:space="preserve">;</w:t>
+      </w:r>
+      <w:r>
+        <w:t xml:space="preserve"> </w:t>
+      </w:r>
+      <w:hyperlink w:anchor="ref-larsen2026dynamicgraphs">
+        <w:r>
+          <w:rPr>
+            <w:rStyle w:val="Hyperlink"/>
+          </w:rPr>
+          <w:t xml:space="preserve">Larsen and Yu 2026</w:t>
+        </w:r>
+      </w:hyperlink>
+      <w:r>
+        <w:t xml:space="preserve">;</w:t>
+      </w:r>
+      <w:r>
+        <w:t xml:space="preserve"> </w:t>
+      </w:r>
+      <w:hyperlink w:anchor="ref-ko2025landscape">
+        <w:r>
+          <w:rPr>
+            <w:rStyle w:val="Hyperlink"/>
+          </w:rPr>
+          <w:t xml:space="preserve">Ko 2025</w:t>
+        </w:r>
+      </w:hyperlink>
+      <w:r>
+        <w:t xml:space="preserve">,</w:t>
+      </w:r>
+      <w:r>
+        <w:t xml:space="preserve"> </w:t>
+      </w:r>
+      <w:hyperlink w:anchor="ref-ko2026boolean">
+        <w:r>
+          <w:rPr>
+            <w:rStyle w:val="Hyperlink"/>
+          </w:rPr>
+          <w:t xml:space="preserve">2026a</w:t>
+        </w:r>
+      </w:hyperlink>
+      <w:r>
+        <w:t xml:space="preserve">,</w:t>
+      </w:r>
+      <w:r>
+        <w:t xml:space="preserve"> </w:t>
+      </w:r>
+      <w:hyperlink w:anchor="ref-ko2026dynamicgraphs">
+        <w:r>
+          <w:rPr>
+            <w:rStyle w:val="Hyperlink"/>
+          </w:rPr>
+          <w:t xml:space="preserve">2026b</w:t>
+        </w:r>
+      </w:hyperlink>
+      <w:r>
+        <w:t xml:space="preserve">)</w:t>
+      </w:r>
+      <w:r>
         <w:t xml:space="preserve">.</w:t>
       </w:r>
     </w:p>
@@ -4269,7 +4359,7 @@
         <w:t xml:space="preserve"> </w:t>
       </w:r>
       <w:r>
-        <w:t xml:space="preserve">claim that local update plus local decode, two-replication support graphs, finite-geometry coding, or sketch-aided adaptive probing are new ideas. The bounded claim is narrower: within the literature searched through October 2026, we did not identify a materially equivalent theorem showing that a random fixed family of</w:t>
+        <w:t xml:space="preserve">claim that local update plus local decode, two-replication support graphs, finite-geometry coding, sketch-aided adaptive probing, or the general dynamic cell-probe/Multiphase framework are new ideas. The bounded claim is narrower: within the literature searched through October 2026, we did not identify a materially equivalent theorem showing that a random fixed family of</w:t>
       </w:r>
       <w:r>
         <w:t xml:space="preserve"> </w:t>
@@ -4865,6 +4955,447 @@
       </w:r>
       <w:r>
         <w:t xml:space="preserve">instructions on every standard word-RAM instruction set.</w:t>
+      </w:r>
+    </w:p>
+    <w:p>
+      <w:pPr>
+        <w:pStyle w:val="BodyText"/>
+      </w:pPr>
+      <w:r>
+        <w:rPr>
+          <w:bCs/>
+          <w:b/>
+        </w:rPr>
+        <w:t xml:space="preserve">Cell-width normalization and robustness.</w:t>
+      </w:r>
+      <w:r>
+        <w:t xml:space="preserve"> </w:t>
+      </w:r>
+      <w:r>
+        <w:t xml:space="preserve">We use the same symbol</w:t>
+      </w:r>
+      <w:r>
+        <w:t xml:space="preserve"> </w:t>
+      </w:r>
+      <m:oMath>
+        <m:r>
+          <m:t>w</m:t>
+        </m:r>
+      </m:oMath>
+      <w:r>
+        <w:t xml:space="preserve"> </w:t>
+      </w:r>
+      <w:r>
+        <w:t xml:space="preserve">for batch size and cell width deliberately. A query returns exactly</w:t>
+      </w:r>
+      <w:r>
+        <w:t xml:space="preserve"> </w:t>
+      </w:r>
+      <m:oMath>
+        <m:r>
+          <m:t>w</m:t>
+        </m:r>
+      </m:oMath>
+      <w:r>
+        <w:t xml:space="preserve"> </w:t>
+      </w:r>
+      <w:r>
+        <w:t xml:space="preserve">bits, so choosing</w:t>
+      </w:r>
+      <w:r>
+        <w:t xml:space="preserve"> </w:t>
+      </w:r>
+      <m:oMath>
+        <m:r>
+          <m:t>w</m:t>
+        </m:r>
+      </m:oMath>
+      <w:r>
+        <w:t xml:space="preserve">-bit cells removes a trivial output-capacity explanation for a large probe lower bound: information-theoretically, one cell is large enough to hold the entire answer. The lower-bound proof is robust to replacing the cell width by any</w:t>
+      </w:r>
+      <w:r>
+        <w:t xml:space="preserve"> </w:t>
+      </w:r>
+      <m:oMath>
+        <m:r>
+          <m:t>b</m:t>
+        </m:r>
+        <m:r>
+          <m:rPr>
+            <m:sty m:val="p"/>
+          </m:rPr>
+          <m:t>=</m:t>
+        </m:r>
+        <m:r>
+          <m:t>Θ</m:t>
+        </m:r>
+        <m:d>
+          <m:dPr>
+            <m:begChr m:val="("/>
+            <m:endChr m:val=")"/>
+            <m:sepChr m:val=""/>
+            <m:grow/>
+          </m:dPr>
+          <m:e>
+            <m:r>
+              <m:t>w</m:t>
+            </m:r>
+          </m:e>
+        </m:d>
+      </m:oMath>
+      <w:r>
+        <w:t xml:space="preserve">. The diffuse branch is independent of cell capacity. In the hub branch, the capacity bounds</w:t>
+      </w:r>
+      <w:r>
+        <w:t xml:space="preserve"> </w:t>
+      </w:r>
+      <m:oMath>
+        <m:r>
+          <m:t>h</m:t>
+        </m:r>
+        <m:r>
+          <m:t>w</m:t>
+        </m:r>
+      </m:oMath>
+      <w:r>
+        <w:t xml:space="preserve"> </w:t>
+      </w:r>
+      <w:r>
+        <w:t xml:space="preserve">and</w:t>
+      </w:r>
+      <w:r>
+        <w:t xml:space="preserve"> </w:t>
+      </w:r>
+      <m:oMath>
+        <m:d>
+          <m:dPr>
+            <m:begChr m:val="("/>
+            <m:endChr m:val=")"/>
+            <m:sepChr m:val=""/>
+            <m:grow/>
+          </m:dPr>
+          <m:e>
+            <m:r>
+              <m:t>h</m:t>
+            </m:r>
+            <m:r>
+              <m:rPr>
+                <m:sty m:val="p"/>
+              </m:rPr>
+              <m:t>+</m:t>
+            </m:r>
+            <m:r>
+              <m:t>1</m:t>
+            </m:r>
+          </m:e>
+        </m:d>
+        <m:r>
+          <m:t>w</m:t>
+        </m:r>
+      </m:oMath>
+      <w:r>
+        <w:t xml:space="preserve"> </w:t>
+      </w:r>
+      <w:r>
+        <w:t xml:space="preserve">become</w:t>
+      </w:r>
+      <w:r>
+        <w:t xml:space="preserve"> </w:t>
+      </w:r>
+      <m:oMath>
+        <m:r>
+          <m:t>h</m:t>
+        </m:r>
+        <m:r>
+          <m:t>b</m:t>
+        </m:r>
+      </m:oMath>
+      <w:r>
+        <w:t xml:space="preserve"> </w:t>
+      </w:r>
+      <w:r>
+        <w:t xml:space="preserve">and</w:t>
+      </w:r>
+      <w:r>
+        <w:t xml:space="preserve"> </w:t>
+      </w:r>
+      <m:oMath>
+        <m:d>
+          <m:dPr>
+            <m:begChr m:val="("/>
+            <m:endChr m:val=")"/>
+            <m:sepChr m:val=""/>
+            <m:grow/>
+          </m:dPr>
+          <m:e>
+            <m:r>
+              <m:t>h</m:t>
+            </m:r>
+            <m:r>
+              <m:rPr>
+                <m:sty m:val="p"/>
+              </m:rPr>
+              <m:t>+</m:t>
+            </m:r>
+            <m:r>
+              <m:t>1</m:t>
+            </m:r>
+          </m:e>
+        </m:d>
+        <m:r>
+          <m:t>b</m:t>
+        </m:r>
+      </m:oMath>
+      <w:r>
+        <w:t xml:space="preserve">, the residual groups remain of size</w:t>
+      </w:r>
+      <w:r>
+        <w:t xml:space="preserve"> </w:t>
+      </w:r>
+      <m:oMath>
+        <m:r>
+          <m:t>O</m:t>
+        </m:r>
+        <m:d>
+          <m:dPr>
+            <m:begChr m:val="("/>
+            <m:endChr m:val=")"/>
+            <m:sepChr m:val=""/>
+            <m:grow/>
+          </m:dPr>
+          <m:e>
+            <m:sSup>
+              <m:e>
+                <m:r>
+                  <m:t>w</m:t>
+                </m:r>
+              </m:e>
+              <m:sup>
+                <m:r>
+                  <m:t>2</m:t>
+                </m:r>
+              </m:sup>
+            </m:sSup>
+          </m:e>
+        </m:d>
+      </m:oMath>
+      <w:r>
+        <w:t xml:space="preserve"> </w:t>
+      </w:r>
+      <w:r>
+        <w:t xml:space="preserve">because</w:t>
+      </w:r>
+      <w:r>
+        <w:t xml:space="preserve"> </w:t>
+      </w:r>
+      <m:oMath>
+        <m:r>
+          <m:t>h</m:t>
+        </m:r>
+        <m:r>
+          <m:rPr>
+            <m:sty m:val="p"/>
+          </m:rPr>
+          <m:t>=</m:t>
+        </m:r>
+        <m:r>
+          <m:t>O</m:t>
+        </m:r>
+        <m:d>
+          <m:dPr>
+            <m:begChr m:val="("/>
+            <m:endChr m:val=")"/>
+            <m:sepChr m:val=""/>
+            <m:grow/>
+          </m:dPr>
+          <m:e>
+            <m:r>
+              <m:t>w</m:t>
+            </m:r>
+          </m:e>
+        </m:d>
+      </m:oMath>
+      <w:r>
+        <w:t xml:space="preserve"> </w:t>
+      </w:r>
+      <w:r>
+        <w:t xml:space="preserve">and</w:t>
+      </w:r>
+      <w:r>
+        <w:t xml:space="preserve"> </w:t>
+      </w:r>
+      <m:oMath>
+        <m:r>
+          <m:t>b</m:t>
+        </m:r>
+        <m:r>
+          <m:rPr>
+            <m:sty m:val="p"/>
+          </m:rPr>
+          <m:t>=</m:t>
+        </m:r>
+        <m:r>
+          <m:t>O</m:t>
+        </m:r>
+        <m:d>
+          <m:dPr>
+            <m:begChr m:val="("/>
+            <m:endChr m:val=")"/>
+            <m:sepChr m:val=""/>
+            <m:grow/>
+          </m:dPr>
+          <m:e>
+            <m:r>
+              <m:t>w</m:t>
+            </m:r>
+          </m:e>
+        </m:d>
+      </m:oMath>
+      <w:r>
+        <w:t xml:space="preserve">, and the free-sketch length becomes</w:t>
+      </w:r>
+      <w:r>
+        <w:t xml:space="preserve"> </w:t>
+      </w:r>
+      <m:oMath>
+        <m:r>
+          <m:t>h</m:t>
+        </m:r>
+        <m:r>
+          <m:t>b</m:t>
+        </m:r>
+      </m:oMath>
+      <w:r>
+        <w:t xml:space="preserve">; choosing the constant in</w:t>
+      </w:r>
+      <w:r>
+        <w:t xml:space="preserve"> </w:t>
+      </w:r>
+      <m:oMath>
+        <m:r>
+          <m:t>L</m:t>
+        </m:r>
+        <m:r>
+          <m:rPr>
+            <m:sty m:val="p"/>
+          </m:rPr>
+          <m:t>=</m:t>
+        </m:r>
+        <m:r>
+          <m:t>Θ</m:t>
+        </m:r>
+        <m:d>
+          <m:dPr>
+            <m:begChr m:val="("/>
+            <m:endChr m:val=")"/>
+            <m:sepChr m:val=""/>
+            <m:grow/>
+          </m:dPr>
+          <m:e>
+            <m:r>
+              <m:t>h</m:t>
+            </m:r>
+          </m:e>
+        </m:d>
+      </m:oMath>
+      <w:r>
+        <w:t xml:space="preserve"> </w:t>
+      </w:r>
+      <w:r>
+        <w:t xml:space="preserve">as a function of the upper constant in</w:t>
+      </w:r>
+      <w:r>
+        <w:t xml:space="preserve"> </w:t>
+      </w:r>
+      <m:oMath>
+        <m:r>
+          <m:t>b</m:t>
+        </m:r>
+        <m:r>
+          <m:rPr>
+            <m:sty m:val="p"/>
+          </m:rPr>
+          <m:t>/</m:t>
+        </m:r>
+        <m:r>
+          <m:t>w</m:t>
+        </m:r>
+      </m:oMath>
+      <w:r>
+        <w:t xml:space="preserve"> </w:t>
+      </w:r>
+      <w:r>
+        <w:t xml:space="preserve">preserves the final</w:t>
+      </w:r>
+      <w:r>
+        <w:t xml:space="preserve"> </w:t>
+      </w:r>
+      <m:oMath>
+        <m:r>
+          <m:t>q</m:t>
+        </m:r>
+        <m:r>
+          <m:rPr>
+            <m:sty m:val="p"/>
+          </m:rPr>
+          <m:t>=</m:t>
+        </m:r>
+        <m:r>
+          <m:t>Ω</m:t>
+        </m:r>
+        <m:d>
+          <m:dPr>
+            <m:begChr m:val="("/>
+            <m:endChr m:val=")"/>
+            <m:sepChr m:val=""/>
+            <m:grow/>
+          </m:dPr>
+          <m:e>
+            <m:r>
+              <m:t>w</m:t>
+            </m:r>
+          </m:e>
+        </m:d>
+      </m:oMath>
+      <w:r>
+        <w:t xml:space="preserve"> </w:t>
+      </w:r>
+      <w:r>
+        <w:t xml:space="preserve">conclusion. We keep</w:t>
+      </w:r>
+      <w:r>
+        <w:t xml:space="preserve"> </w:t>
+      </w:r>
+      <m:oMath>
+        <m:r>
+          <m:t>b</m:t>
+        </m:r>
+        <m:r>
+          <m:rPr>
+            <m:sty m:val="p"/>
+          </m:rPr>
+          <m:t>=</m:t>
+        </m:r>
+        <m:r>
+          <m:t>w</m:t>
+        </m:r>
+      </m:oMath>
+      <w:r>
+        <w:t xml:space="preserve"> </w:t>
+      </w:r>
+      <w:r>
+        <w:t xml:space="preserve">in the formal statement and proof to avoid a second size parameter. No claim is made here for cell widths growing asymptotically faster than</w:t>
+      </w:r>
+      <w:r>
+        <w:t xml:space="preserve"> </w:t>
+      </w:r>
+      <m:oMath>
+        <m:r>
+          <m:t>w</m:t>
+        </m:r>
+      </m:oMath>
+      <w:r>
+        <w:t xml:space="preserve">.</w:t>
       </w:r>
     </w:p>
     <w:bookmarkEnd w:id="23"/>
@@ -28450,7 +28981,7 @@
       </w:r>
     </w:p>
     <w:bookmarkEnd w:id="55"/>
-    <w:bookmarkStart w:id="62" w:name="related-work"/>
+    <w:bookmarkStart w:id="63" w:name="related-work"/>
     <w:p>
       <w:pPr>
         <w:pStyle w:val="Heading1"/>
@@ -28906,13 +29437,13 @@
       </w:r>
     </w:p>
     <w:bookmarkEnd w:id="60"/>
-    <w:bookmarkStart w:id="61" w:name="X55f5b2252ac1cbb2fe3bdf1d93768e4693d256b"/>
+    <w:bookmarkStart w:id="61" w:name="X65ff485d52b945d0293ff395d01f98bb22b435f"/>
     <w:p>
       <w:pPr>
         <w:pStyle w:val="Heading2"/>
       </w:pPr>
       <w:r>
-        <w:t xml:space="preserve">11.6 Novelty boundary after the October 2026 search</w:t>
+        <w:t xml:space="preserve">11.6 Dynamic cell-probe and Multiphase lower bounds</w:t>
       </w:r>
     </w:p>
     <w:p>
@@ -28920,7 +29451,245 @@
         <w:pStyle w:val="FirstParagraph"/>
       </w:pPr>
       <w:r>
-        <w:t xml:space="preserve">The literature search for this manuscript included batch codes, graph batch codes, functional batch/PIR codes, arbitrary-access-set codes, locally updatable/locally decodable codes, local decode/update compression, adaptive sketch-probe lower bounds, write locality, and dynamic cell-probe lower bounds. Recent 2026 work on functional batch codes with small recovery sets was included explicitly</w:t>
+        <w:t xml:space="preserve">Pătraşcu’s Multiphase problem was introduced as a central vehicle for dynamic lower bounds</w:t>
+      </w:r>
+      <w:r>
+        <w:t xml:space="preserve"> </w:t>
+      </w:r>
+      <w:r>
+        <w:t xml:space="preserve">(</w:t>
+      </w:r>
+      <w:hyperlink w:anchor="ref-patrascu2010multiphase">
+        <w:r>
+          <w:rPr>
+            <w:rStyle w:val="Hyperlink"/>
+          </w:rPr>
+          <w:t xml:space="preserve">Pătraşcu 2010</w:t>
+        </w:r>
+      </w:hyperlink>
+      <w:r>
+        <w:t xml:space="preserve">)</w:t>
+      </w:r>
+      <w:r>
+        <w:t xml:space="preserve">. Subsequent work pushed unconditional dynamic cell-probe lower bounds beyond the logarithmic barrier for Boolean problems</w:t>
+      </w:r>
+      <w:r>
+        <w:t xml:space="preserve"> </w:t>
+      </w:r>
+      <w:r>
+        <w:t xml:space="preserve">(</w:t>
+      </w:r>
+      <w:hyperlink w:anchor="ref-larsen2020boolean">
+        <w:r>
+          <w:rPr>
+            <w:rStyle w:val="Hyperlink"/>
+          </w:rPr>
+          <w:t xml:space="preserve">Larsen, Weinstein, and Yu 2020</w:t>
+        </w:r>
+      </w:hyperlink>
+      <w:r>
+        <w:t xml:space="preserve">)</w:t>
+      </w:r>
+      <w:r>
+        <w:t xml:space="preserve"> </w:t>
+      </w:r>
+      <w:r>
+        <w:t xml:space="preserve">and for natural dynamic graph problems</w:t>
+      </w:r>
+      <w:r>
+        <w:t xml:space="preserve"> </w:t>
+      </w:r>
+      <w:r>
+        <w:t xml:space="preserve">(</w:t>
+      </w:r>
+      <w:hyperlink w:anchor="ref-larsen2026dynamicgraphs">
+        <w:r>
+          <w:rPr>
+            <w:rStyle w:val="Hyperlink"/>
+          </w:rPr>
+          <w:t xml:space="preserve">Larsen and Yu 2026</w:t>
+        </w:r>
+      </w:hyperlink>
+      <w:r>
+        <w:t xml:space="preserve">)</w:t>
+      </w:r>
+      <w:r>
+        <w:t xml:space="preserve">. More recent work develops a unified Multiphase/communication framework</w:t>
+      </w:r>
+      <w:r>
+        <w:t xml:space="preserve"> </w:t>
+      </w:r>
+      <w:r>
+        <w:t xml:space="preserve">(</w:t>
+      </w:r>
+      <w:hyperlink w:anchor="ref-ko2025landscape">
+        <w:r>
+          <w:rPr>
+            <w:rStyle w:val="Hyperlink"/>
+          </w:rPr>
+          <w:t xml:space="preserve">Ko 2025</w:t>
+        </w:r>
+      </w:hyperlink>
+      <w:r>
+        <w:t xml:space="preserve">)</w:t>
+      </w:r>
+      <w:r>
+        <w:t xml:space="preserve">, obtains an</w:t>
+      </w:r>
+      <w:r>
+        <w:t xml:space="preserve"> </w:t>
+      </w:r>
+      <m:oMath>
+        <m:r>
+          <m:t>Ω</m:t>
+        </m:r>
+        <m:d>
+          <m:dPr>
+            <m:begChr m:val="("/>
+            <m:endChr m:val=")"/>
+            <m:sepChr m:val=""/>
+            <m:grow/>
+          </m:dPr>
+          <m:e>
+            <m:sSup>
+              <m:e>
+                <m:d>
+                  <m:dPr>
+                    <m:begChr m:val="("/>
+                    <m:endChr m:val=")"/>
+                    <m:sepChr m:val=""/>
+                    <m:grow/>
+                  </m:dPr>
+                  <m:e>
+                    <m:r>
+                      <m:rPr>
+                        <m:sty m:val="p"/>
+                      </m:rPr>
+                      <m:t>log</m:t>
+                    </m:r>
+                    <m:r>
+                      <m:t>n</m:t>
+                    </m:r>
+                    <m:r>
+                      <m:rPr>
+                        <m:sty m:val="p"/>
+                      </m:rPr>
+                      <m:t>/</m:t>
+                    </m:r>
+                    <m:r>
+                      <m:rPr>
+                        <m:sty m:val="p"/>
+                      </m:rPr>
+                      <m:t>log</m:t>
+                    </m:r>
+                    <m:r>
+                      <m:rPr>
+                        <m:sty m:val="p"/>
+                      </m:rPr>
+                      <m:t>log</m:t>
+                    </m:r>
+                    <m:r>
+                      <m:t>n</m:t>
+                    </m:r>
+                  </m:e>
+                </m:d>
+              </m:e>
+              <m:sup>
+                <m:r>
+                  <m:t>2</m:t>
+                </m:r>
+              </m:sup>
+            </m:sSup>
+          </m:e>
+        </m:d>
+      </m:oMath>
+      <w:r>
+        <w:t xml:space="preserve"> </w:t>
+      </w:r>
+      <w:r>
+        <w:t xml:space="preserve">lower bound for a Boolean Multiphase instantiation</w:t>
+      </w:r>
+      <w:r>
+        <w:t xml:space="preserve"> </w:t>
+      </w:r>
+      <w:r>
+        <w:t xml:space="preserve">(</w:t>
+      </w:r>
+      <w:hyperlink w:anchor="ref-ko2026boolean">
+        <w:r>
+          <w:rPr>
+            <w:rStyle w:val="Hyperlink"/>
+          </w:rPr>
+          <w:t xml:space="preserve">Ko 2026a</w:t>
+        </w:r>
+      </w:hyperlink>
+      <w:r>
+        <w:t xml:space="preserve">)</w:t>
+      </w:r>
+      <w:r>
+        <w:t xml:space="preserve">, and transfers the same scale to incremental graph problems including undirected shortest paths</w:t>
+      </w:r>
+      <w:r>
+        <w:t xml:space="preserve"> </w:t>
+      </w:r>
+      <w:r>
+        <w:t xml:space="preserve">(</w:t>
+      </w:r>
+      <w:hyperlink w:anchor="ref-ko2026dynamicgraphs">
+        <w:r>
+          <w:rPr>
+            <w:rStyle w:val="Hyperlink"/>
+          </w:rPr>
+          <w:t xml:space="preserve">Ko 2026b</w:t>
+        </w:r>
+      </w:hyperlink>
+      <w:r>
+        <w:t xml:space="preserve">)</w:t>
+      </w:r>
+      <w:r>
+        <w:t xml:space="preserve">.</w:t>
+      </w:r>
+    </w:p>
+    <w:p>
+      <w:pPr>
+        <w:pStyle w:val="BodyText"/>
+      </w:pPr>
+      <w:r>
+        <w:t xml:space="preserve">FBDG lies next to this lineage but asks a different question. Classical dynamic cell-probe results measure update and query</w:t>
+      </w:r>
+      <w:r>
+        <w:t xml:space="preserve"> </w:t>
+      </w:r>
+      <w:r>
+        <w:rPr>
+          <w:bCs/>
+          <w:b/>
+        </w:rPr>
+        <w:t xml:space="preserve">time</w:t>
+      </w:r>
+      <w:r>
+        <w:t xml:space="preserve"> </w:t>
+      </w:r>
+      <w:r>
+        <w:t xml:space="preserve">for a dynamic problem, usually with unrestricted locations for the cells modified by an update. FBDG instead fixes a family of vector-valued retrieval requests and asks what exact recovery locality is forced by an exceptionally strong write-location restriction: each source coordinate may affect at most two fixed essential cells. Conversely, Theorem 5.1 does not imply the stronger time lower bounds obtained in Multiphase-style work. The two lines are therefore complementary rather than competing: Multiphase results characterize general dynamic hardness, whereas the FBDG separation isolates how prescribed incidence structure interacts with fixed write locality.</w:t>
+      </w:r>
+    </w:p>
+    <w:bookmarkEnd w:id="61"/>
+    <w:bookmarkStart w:id="62" w:name="X55f5b2252ac1cbb2fe3bdf1d93768e4693d256b"/>
+    <w:p>
+      <w:pPr>
+        <w:pStyle w:val="Heading2"/>
+      </w:pPr>
+      <w:r>
+        <w:t xml:space="preserve">11.7 Novelty boundary after the October 2026 search</w:t>
+      </w:r>
+    </w:p>
+    <w:p>
+      <w:pPr>
+        <w:pStyle w:val="FirstParagraph"/>
+      </w:pPr>
+      <w:r>
+        <w:t xml:space="preserve">The literature search for this manuscript included batch codes, graph batch codes, functional batch/PIR codes, arbitrary-access-set codes, locally updatable/locally decodable codes, local decode/update compression, adaptive sketch-probe lower bounds, write locality, the Multiphase framework, and modern dynamic cell-probe lower bounds. Recent 2026 work on functional batch codes with small recovery sets and on near-quadratic-logarithmic dynamic cell-probe lower bounds was included explicitly</w:t>
       </w:r>
       <w:r>
         <w:t xml:space="preserve"> </w:t>
@@ -28937,6 +29706,34 @@
         </w:r>
       </w:hyperlink>
       <w:r>
+        <w:t xml:space="preserve">;</w:t>
+      </w:r>
+      <w:r>
+        <w:t xml:space="preserve"> </w:t>
+      </w:r>
+      <w:hyperlink w:anchor="ref-ko2026boolean">
+        <w:r>
+          <w:rPr>
+            <w:rStyle w:val="Hyperlink"/>
+          </w:rPr>
+          <w:t xml:space="preserve">Ko 2026a</w:t>
+        </w:r>
+      </w:hyperlink>
+      <w:r>
+        <w:t xml:space="preserve">,</w:t>
+      </w:r>
+      <w:r>
+        <w:t xml:space="preserve"> </w:t>
+      </w:r>
+      <w:hyperlink w:anchor="ref-ko2026dynamicgraphs">
+        <w:r>
+          <w:rPr>
+            <w:rStyle w:val="Hyperlink"/>
+          </w:rPr>
+          <w:t xml:space="preserve">2026b</w:t>
+        </w:r>
+      </w:hyperlink>
+      <w:r>
         <w:t xml:space="preserve">)</w:t>
       </w:r>
       <w:r>
@@ -28999,9 +29796,9 @@
         <w:t xml:space="preserve">as absolute claims.</w:t>
       </w:r>
     </w:p>
-    <w:bookmarkEnd w:id="61"/>
     <w:bookmarkEnd w:id="62"/>
-    <w:bookmarkStart w:id="67" w:name="discussion"/>
+    <w:bookmarkEnd w:id="63"/>
+    <w:bookmarkStart w:id="68" w:name="discussion"/>
     <w:p>
       <w:pPr>
         <w:pStyle w:val="Heading1"/>
@@ -29010,7 +29807,7 @@
         <w:t xml:space="preserve">12. Discussion</w:t>
       </w:r>
     </w:p>
-    <w:bookmarkStart w:id="63" w:name="what-the-separation-says"/>
+    <w:bookmarkStart w:id="64" w:name="what-the-separation-says"/>
     <w:p>
       <w:pPr>
         <w:pStyle w:val="Heading2"/>
@@ -29053,8 +29850,8 @@
         <w:t xml:space="preserve">The actual obstruction is that a two-write canonical encoding has only two ways to make many coordinates jointly accessible: reuse the same cells heavily or keep their supports dispersed. The proof attacks those two possibilities separately.</w:t>
       </w:r>
     </w:p>
-    <w:bookmarkEnd w:id="63"/>
-    <w:bookmarkStart w:id="64" w:name="X2233858bca08a7b705f45a347340753c382c715"/>
+    <w:bookmarkEnd w:id="64"/>
+    <w:bookmarkStart w:id="65" w:name="X2233858bca08a7b705f45a347340753c382c715"/>
     <w:p>
       <w:pPr>
         <w:pStyle w:val="Heading2"/>
@@ -29079,8 +29876,8 @@
         <w:t xml:space="preserve">This is important because linear sparse-factorization lower bounds alone cannot establish the theorem: the structured Fano gadget itself is linear, but the hard-family theorem must exclude nonlinear alternatives as well.</w:t>
       </w:r>
     </w:p>
-    <w:bookmarkEnd w:id="64"/>
-    <w:bookmarkStart w:id="65" w:name="X14159cbfac26749a8467a72921bdcc4490a7f9a"/>
+    <w:bookmarkEnd w:id="65"/>
+    <w:bookmarkStart w:id="66" w:name="X14159cbfac26749a8467a72921bdcc4490a7f9a"/>
     <w:p>
       <w:pPr>
         <w:pStyle w:val="Heading2"/>
@@ -29097,8 +29894,8 @@
         <w:t xml:space="preserve">Adaptivity is handled twice. The hitting lemma follows the actual decision path and shows that avoiding a changed support yields the same transcript after a source-bit flip. The sketch-probe lemma treats each sketch value as an arbitrary adaptive decision tree. No step replaces the adaptive decoder by a fixed nonadaptive probe set.</w:t>
       </w:r>
     </w:p>
-    <w:bookmarkEnd w:id="65"/>
-    <w:bookmarkStart w:id="66" w:name="toward-deterministic-hard-families"/>
+    <w:bookmarkEnd w:id="66"/>
+    <w:bookmarkStart w:id="67" w:name="toward-deterministic-hard-families"/>
     <w:p>
       <w:pPr>
         <w:pStyle w:val="Heading2"/>
@@ -29123,9 +29920,9 @@
         <w:t xml:space="preserve">The most demanding requirement is the uniform diffuse matching property, because it must hold against every possible two-support system after the family is fixed. Expander- or extractor-like incidence constructions are natural candidates, but the required quantifier structure is stronger than ordinary pairwise expansion.</w:t>
       </w:r>
     </w:p>
-    <w:bookmarkEnd w:id="66"/>
     <w:bookmarkEnd w:id="67"/>
-    <w:bookmarkStart w:id="68" w:name="limitations-and-open-problems"/>
+    <w:bookmarkEnd w:id="68"/>
+    <w:bookmarkStart w:id="69" w:name="limitations-and-open-problems"/>
     <w:p>
       <w:pPr>
         <w:pStyle w:val="Heading1"/>
@@ -29214,56 +30011,40 @@
           <w:bCs/>
           <w:b/>
         </w:rPr>
-        <w:t xml:space="preserve">Word-operation time.</w:t>
-      </w:r>
-      <w:r>
-        <w:t xml:space="preserve"> </w:t>
-      </w:r>
-      <w:r>
-        <w:t xml:space="preserve">The paper is a locality/cell-probe result. The structured construction guarantees two cell reads, not a universal constant instruction count for assembling every packed output under every standard word-RAM instruction set.</w:t>
-      </w:r>
-    </w:p>
-    <w:p>
-      <w:pPr>
-        <w:pStyle w:val="BodyText"/>
-      </w:pPr>
-      <w:r>
-        <w:rPr>
-          <w:bCs/>
-          <w:b/>
-        </w:rPr>
-        <w:t xml:space="preserve">Random rather than explicit hard family.</w:t>
-      </w:r>
-      <w:r>
-        <w:t xml:space="preserve"> </w:t>
-      </w:r>
-      <w:r>
-        <w:t xml:space="preserve">The hard family is sampled randomly. Producing a deterministic explicit family with the same universal hardness property is open.</w:t>
-      </w:r>
-    </w:p>
-    <w:p>
-      <w:pPr>
-        <w:pStyle w:val="BodyText"/>
-      </w:pPr>
-      <w:r>
-        <w:rPr>
-          <w:bCs/>
-          <w:b/>
-        </w:rPr>
-        <w:t xml:space="preserve">Constant optimization.</w:t>
-      </w:r>
-      <w:r>
-        <w:t xml:space="preserve"> </w:t>
-      </w:r>
-      <w:r>
-        <w:t xml:space="preserve">The proof intentionally uses wasteful constants. The scientific statement is asymptotic</w:t>
-      </w:r>
-      <w:r>
-        <w:t xml:space="preserve"> </w:t>
-      </w:r>
-      <m:oMath>
-        <m:r>
-          <m:t>Ω</m:t>
+        <w:t xml:space="preserve">Cell width.</w:t>
+      </w:r>
+      <w:r>
+        <w:t xml:space="preserve"> </w:t>
+      </w:r>
+      <w:r>
+        <w:t xml:space="preserve">The formal model normalizes cell width to the batch size</w:t>
+      </w:r>
+      <w:r>
+        <w:t xml:space="preserve"> </w:t>
+      </w:r>
+      <m:oMath>
+        <m:r>
+          <m:t>w</m:t>
+        </m:r>
+      </m:oMath>
+      <w:r>
+        <w:t xml:space="preserve">. As noted in Section 2.1, the same asymptotic lower bound is robust to constant-factor cell widths</w:t>
+      </w:r>
+      <w:r>
+        <w:t xml:space="preserve"> </w:t>
+      </w:r>
+      <m:oMath>
+        <m:r>
+          <m:t>b</m:t>
+        </m:r>
+        <m:r>
+          <m:rPr>
+            <m:sty m:val="p"/>
+          </m:rPr>
+          <m:t>=</m:t>
+        </m:r>
+        <m:r>
+          <m:t>Θ</m:t>
         </m:r>
         <m:d>
           <m:dPr>
@@ -29280,33 +30061,10 @@
         </m:d>
       </m:oMath>
       <w:r>
-        <w:t xml:space="preserve">; improving</w:t>
-      </w:r>
-      <w:r>
-        <w:t xml:space="preserve"> </w:t>
-      </w:r>
-      <m:oMath>
-        <m:sSub>
-          <m:e>
-            <m:r>
-              <m:t>c</m:t>
-            </m:r>
-          </m:e>
-          <m:sub>
-            <m:r>
-              <m:rPr>
-                <m:sty m:val="p"/>
-              </m:rPr>
-              <m:t>*</m:t>
-            </m:r>
-          </m:sub>
-        </m:sSub>
-      </m:oMath>
-      <w:r>
-        <w:t xml:space="preserve"> </w:t>
-      </w:r>
-      <w:r>
-        <w:t xml:space="preserve">is not pursued.</w:t>
+        <w:t xml:space="preserve"> </w:t>
+      </w:r>
+      <w:r>
+        <w:t xml:space="preserve">after adjusting constants in the hub argument. Widths growing asymptotically faster than the answer size are outside the stated result.</w:t>
       </w:r>
     </w:p>
     <w:p>
@@ -29314,33 +30072,58 @@
         <w:pStyle w:val="BodyText"/>
       </w:pPr>
       <w:r>
-        <w:t xml:space="preserve">These limitations lead to several concrete questions.</w:t>
-      </w:r>
-    </w:p>
-    <w:p>
-      <w:pPr>
-        <w:numPr>
-          <w:ilvl w:val="0"/>
-          <w:numId w:val="1004"/>
-        </w:numPr>
-        <w:pStyle w:val="Compact"/>
-      </w:pPr>
-      <w:r>
-        <w:t xml:space="preserve">Can one prove</w:t>
-      </w:r>
-      <w:r>
-        <w:t xml:space="preserve"> </w:t>
-      </w:r>
-      <m:oMath>
-        <m:r>
-          <m:t>q</m:t>
-        </m:r>
-        <m:r>
-          <m:rPr>
-            <m:sty m:val="p"/>
-          </m:rPr>
-          <m:t>=</m:t>
-        </m:r>
+        <w:rPr>
+          <w:bCs/>
+          <w:b/>
+        </w:rPr>
+        <w:t xml:space="preserve">Word-operation time.</w:t>
+      </w:r>
+      <w:r>
+        <w:t xml:space="preserve"> </w:t>
+      </w:r>
+      <w:r>
+        <w:t xml:space="preserve">The paper is a locality/cell-probe result. The structured construction guarantees two cell reads, not a universal constant instruction count for assembling every packed output under every standard word-RAM instruction set.</w:t>
+      </w:r>
+    </w:p>
+    <w:p>
+      <w:pPr>
+        <w:pStyle w:val="BodyText"/>
+      </w:pPr>
+      <w:r>
+        <w:rPr>
+          <w:bCs/>
+          <w:b/>
+        </w:rPr>
+        <w:t xml:space="preserve">Random rather than explicit hard family.</w:t>
+      </w:r>
+      <w:r>
+        <w:t xml:space="preserve"> </w:t>
+      </w:r>
+      <w:r>
+        <w:t xml:space="preserve">The hard family is sampled randomly. Producing a deterministic explicit family with the same universal hardness property is open.</w:t>
+      </w:r>
+    </w:p>
+    <w:p>
+      <w:pPr>
+        <w:pStyle w:val="BodyText"/>
+      </w:pPr>
+      <w:r>
+        <w:rPr>
+          <w:bCs/>
+          <w:b/>
+        </w:rPr>
+        <w:t xml:space="preserve">Constant optimization.</w:t>
+      </w:r>
+      <w:r>
+        <w:t xml:space="preserve"> </w:t>
+      </w:r>
+      <w:r>
+        <w:t xml:space="preserve">The proof intentionally uses wasteful constants. The scientific statement is asymptotic</w:t>
+      </w:r>
+      <w:r>
+        <w:t xml:space="preserve"> </w:t>
+      </w:r>
+      <m:oMath>
         <m:r>
           <m:t>Ω</m:t>
         </m:r>
@@ -29359,44 +30142,41 @@
         </m:d>
       </m:oMath>
       <w:r>
-        <w:t xml:space="preserve"> </w:t>
-      </w:r>
-      <w:r>
-        <w:t xml:space="preserve">for random</w:t>
-      </w:r>
-      <w:r>
-        <w:t xml:space="preserve"> </w:t>
-      </w:r>
-      <m:oMath>
-        <m:r>
-          <m:t>w</m:t>
-        </m:r>
-      </m:oMath>
-      <w:r>
-        <w:t xml:space="preserve">-uniform families with</w:t>
-      </w:r>
-      <w:r>
-        <w:t xml:space="preserve"> </w:t>
-      </w:r>
-      <m:oMath>
-        <m:r>
-          <m:t>u</m:t>
-        </m:r>
-        <m:r>
-          <m:rPr>
-            <m:sty m:val="p"/>
-          </m:rPr>
-          <m:t>=</m:t>
-        </m:r>
-        <m:r>
-          <m:t>2</m:t>
-        </m:r>
-      </m:oMath>
-      <w:r>
-        <w:t xml:space="preserve"> </w:t>
-      </w:r>
-      <w:r>
-        <w:t xml:space="preserve">when write locations may move with the state or history?</w:t>
+        <w:t xml:space="preserve">; improving</w:t>
+      </w:r>
+      <w:r>
+        <w:t xml:space="preserve"> </w:t>
+      </w:r>
+      <m:oMath>
+        <m:sSub>
+          <m:e>
+            <m:r>
+              <m:t>c</m:t>
+            </m:r>
+          </m:e>
+          <m:sub>
+            <m:r>
+              <m:rPr>
+                <m:sty m:val="p"/>
+              </m:rPr>
+              <m:t>*</m:t>
+            </m:r>
+          </m:sub>
+        </m:sSub>
+      </m:oMath>
+      <w:r>
+        <w:t xml:space="preserve"> </w:t>
+      </w:r>
+      <w:r>
+        <w:t xml:space="preserve">is not pursued.</w:t>
+      </w:r>
+    </w:p>
+    <w:p>
+      <w:pPr>
+        <w:pStyle w:val="BodyText"/>
+      </w:pPr>
+      <w:r>
+        <w:t xml:space="preserve">These limitations lead to several concrete questions.</w:t>
       </w:r>
     </w:p>
     <w:p>
@@ -29408,39 +30188,7 @@
         <w:pStyle w:val="Compact"/>
       </w:pPr>
       <w:r>
-        <w:t xml:space="preserve">Does an analogous fixed-support theorem hold for every constant</w:t>
-      </w:r>
-      <w:r>
-        <w:t xml:space="preserve"> </w:t>
-      </w:r>
-      <m:oMath>
-        <m:r>
-          <m:t>u</m:t>
-        </m:r>
-        <m:r>
-          <m:rPr>
-            <m:sty m:val="p"/>
-          </m:rPr>
-          <m:t>&gt;</m:t>
-        </m:r>
-        <m:r>
-          <m:t>2</m:t>
-        </m:r>
-      </m:oMath>
-      <w:r>
-        <w:t xml:space="preserve">?</w:t>
-      </w:r>
-    </w:p>
-    <w:p>
-      <w:pPr>
-        <w:numPr>
-          <w:ilvl w:val="0"/>
-          <w:numId w:val="1004"/>
-        </w:numPr>
-        <w:pStyle w:val="Compact"/>
-      </w:pPr>
-      <w:r>
-        <w:t xml:space="preserve">What deterministic incidence parameter exactly separates families admitting</w:t>
+        <w:t xml:space="preserve">Can one prove</w:t>
       </w:r>
       <w:r>
         <w:t xml:space="preserve"> </w:t>
@@ -29456,7 +30204,7 @@
           <m:t>=</m:t>
         </m:r>
         <m:r>
-          <m:t>O</m:t>
+          <m:t>Ω</m:t>
         </m:r>
         <m:d>
           <m:dPr>
@@ -29467,7 +30215,7 @@
           </m:dPr>
           <m:e>
             <m:r>
-              <m:t>1</m:t>
+              <m:t>w</m:t>
             </m:r>
           </m:e>
         </m:d>
@@ -29476,14 +30224,25 @@
         <w:t xml:space="preserve"> </w:t>
       </w:r>
       <w:r>
-        <w:t xml:space="preserve">from families forcing</w:t>
-      </w:r>
-      <w:r>
-        <w:t xml:space="preserve"> </w:t>
-      </w:r>
-      <m:oMath>
-        <m:r>
-          <m:t>q</m:t>
+        <w:t xml:space="preserve">for random</w:t>
+      </w:r>
+      <w:r>
+        <w:t xml:space="preserve"> </w:t>
+      </w:r>
+      <m:oMath>
+        <m:r>
+          <m:t>w</m:t>
+        </m:r>
+      </m:oMath>
+      <w:r>
+        <w:t xml:space="preserve">-uniform families with</w:t>
+      </w:r>
+      <w:r>
+        <w:t xml:space="preserve"> </w:t>
+      </w:r>
+      <m:oMath>
+        <m:r>
+          <m:t>u</m:t>
         </m:r>
         <m:r>
           <m:rPr>
@@ -29492,7 +30251,74 @@
           <m:t>=</m:t>
         </m:r>
         <m:r>
-          <m:t>Ω</m:t>
+          <m:t>2</m:t>
+        </m:r>
+      </m:oMath>
+      <w:r>
+        <w:t xml:space="preserve"> </w:t>
+      </w:r>
+      <w:r>
+        <w:t xml:space="preserve">when write locations may move with the state or history?</w:t>
+      </w:r>
+    </w:p>
+    <w:p>
+      <w:pPr>
+        <w:numPr>
+          <w:ilvl w:val="0"/>
+          <w:numId w:val="1004"/>
+        </w:numPr>
+        <w:pStyle w:val="Compact"/>
+      </w:pPr>
+      <w:r>
+        <w:t xml:space="preserve">Does an analogous fixed-support theorem hold for every constant</w:t>
+      </w:r>
+      <w:r>
+        <w:t xml:space="preserve"> </w:t>
+      </w:r>
+      <m:oMath>
+        <m:r>
+          <m:t>u</m:t>
+        </m:r>
+        <m:r>
+          <m:rPr>
+            <m:sty m:val="p"/>
+          </m:rPr>
+          <m:t>&gt;</m:t>
+        </m:r>
+        <m:r>
+          <m:t>2</m:t>
+        </m:r>
+      </m:oMath>
+      <w:r>
+        <w:t xml:space="preserve">?</w:t>
+      </w:r>
+    </w:p>
+    <w:p>
+      <w:pPr>
+        <w:numPr>
+          <w:ilvl w:val="0"/>
+          <w:numId w:val="1004"/>
+        </w:numPr>
+        <w:pStyle w:val="Compact"/>
+      </w:pPr>
+      <w:r>
+        <w:t xml:space="preserve">What deterministic incidence parameter exactly separates families admitting</w:t>
+      </w:r>
+      <w:r>
+        <w:t xml:space="preserve"> </w:t>
+      </w:r>
+      <m:oMath>
+        <m:r>
+          <m:t>q</m:t>
+        </m:r>
+        <m:r>
+          <m:rPr>
+            <m:sty m:val="p"/>
+          </m:rPr>
+          <m:t>=</m:t>
+        </m:r>
+        <m:r>
+          <m:t>O</m:t>
         </m:r>
         <m:d>
           <m:dPr>
@@ -29503,71 +30329,16 @@
           </m:dPr>
           <m:e>
             <m:r>
-              <m:t>w</m:t>
+              <m:t>1</m:t>
             </m:r>
           </m:e>
         </m:d>
       </m:oMath>
       <w:r>
-        <w:t xml:space="preserve">?</w:t>
-      </w:r>
-    </w:p>
-    <w:p>
-      <w:pPr>
-        <w:numPr>
-          <w:ilvl w:val="0"/>
-          <w:numId w:val="1004"/>
-        </w:numPr>
-        <w:pStyle w:val="Compact"/>
-      </w:pPr>
-      <w:r>
-        <w:t xml:space="preserve">Can the random-family events in Section 7 be realized by an explicit efficiently constructible family?</w:t>
-      </w:r>
-    </w:p>
-    <w:p>
-      <w:pPr>
-        <w:numPr>
-          <w:ilvl w:val="0"/>
-          <w:numId w:val="1004"/>
-        </w:numPr>
-        <w:pStyle w:val="Compact"/>
-      </w:pPr>
-      <w:r>
-        <w:t xml:space="preserve">Can one characterize the additional power of noncanonical history-dependent representations separately from state-dependent physical support motion?</w:t>
-      </w:r>
-    </w:p>
-    <w:bookmarkEnd w:id="68"/>
-    <w:bookmarkStart w:id="69" w:name="conclusion"/>
-    <w:p>
-      <w:pPr>
-        <w:pStyle w:val="Heading1"/>
-      </w:pPr>
-      <w:r>
-        <w:t xml:space="preserve">14. Conclusion</w:t>
-      </w:r>
-    </w:p>
-    <w:p>
-      <w:pPr>
-        <w:pStyle w:val="FirstParagraph"/>
-      </w:pPr>
-      <w:r>
-        <w:t xml:space="preserve">Fixed-batch dynamic retrieval exhibits a genuine structure-versus-randomness locality separation. Two fixed writes per source coordinate are sufficient for two-probe exact recovery on explicit highly structured families with logarithmic batch size. The same write budget is insufficient for random logarithmic-size batch families: with high probability every exact canonical representation, even with arbitrary nonlinear cells and fully adaptive queries, requires a linear number of word probes.</w:t>
-      </w:r>
-    </w:p>
-    <w:p>
-      <w:pPr>
-        <w:pStyle w:val="BodyText"/>
-      </w:pPr>
-      <w:r>
-        <w:t xml:space="preserve">The proof identifies the mechanism behind the separation. A fixed support system is either diffuse, in which case a random request exposes many disjoint dependencies, or hub-concentrated, in which case the hub supplies only a short global sketch and the remaining information is dispersed across small residual groups. Random incidence defeats both geometries.</w:t>
-      </w:r>
-    </w:p>
-    <w:p>
-      <w:pPr>
-        <w:pStyle w:val="BodyText"/>
-      </w:pPr>
-      <w:r>
-        <w:t xml:space="preserve">The remaining frontier is correspondingly precise. To beat the random-family barrier with two writes, an unrestricted representation must exploit support motion strongly enough to maintain high-influence hubs while changing which physical cells play that role across states. Whether such moving geometry can actually yield</w:t>
+        <w:t xml:space="preserve"> </w:t>
+      </w:r>
+      <w:r>
+        <w:t xml:space="preserve">from families forcing</w:t>
       </w:r>
       <w:r>
         <w:t xml:space="preserve"> </w:t>
@@ -29583,7 +30354,7 @@
           <m:t>=</m:t>
         </m:r>
         <m:r>
-          <m:t>o</m:t>
+          <m:t>Ω</m:t>
         </m:r>
         <m:d>
           <m:dPr>
@@ -29600,14 +30371,105 @@
         </m:d>
       </m:oMath>
       <w:r>
+        <w:t xml:space="preserve">?</w:t>
+      </w:r>
+    </w:p>
+    <w:p>
+      <w:pPr>
+        <w:numPr>
+          <w:ilvl w:val="0"/>
+          <w:numId w:val="1004"/>
+        </w:numPr>
+        <w:pStyle w:val="Compact"/>
+      </w:pPr>
+      <w:r>
+        <w:t xml:space="preserve">Can the random-family events in Section 7 be realized by an explicit efficiently constructible family?</w:t>
+      </w:r>
+    </w:p>
+    <w:p>
+      <w:pPr>
+        <w:numPr>
+          <w:ilvl w:val="0"/>
+          <w:numId w:val="1004"/>
+        </w:numPr>
+        <w:pStyle w:val="Compact"/>
+      </w:pPr>
+      <w:r>
+        <w:t xml:space="preserve">Can one characterize the additional power of noncanonical history-dependent representations separately from state-dependent physical support motion?</w:t>
+      </w:r>
+    </w:p>
+    <w:bookmarkEnd w:id="69"/>
+    <w:bookmarkStart w:id="70" w:name="conclusion"/>
+    <w:p>
+      <w:pPr>
+        <w:pStyle w:val="Heading1"/>
+      </w:pPr>
+      <w:r>
+        <w:t xml:space="preserve">14. Conclusion</w:t>
+      </w:r>
+    </w:p>
+    <w:p>
+      <w:pPr>
+        <w:pStyle w:val="FirstParagraph"/>
+      </w:pPr>
+      <w:r>
+        <w:t xml:space="preserve">Fixed-batch dynamic retrieval exhibits a genuine structure-versus-randomness locality separation. Two fixed writes per source coordinate are sufficient for two-probe exact recovery on explicit highly structured families with logarithmic batch size. The same write budget is insufficient for random logarithmic-size batch families: with high probability every exact canonical representation, even with arbitrary nonlinear cells and fully adaptive queries, requires a linear number of word probes.</w:t>
+      </w:r>
+    </w:p>
+    <w:p>
+      <w:pPr>
+        <w:pStyle w:val="BodyText"/>
+      </w:pPr>
+      <w:r>
+        <w:t xml:space="preserve">The proof identifies the mechanism behind the separation. A fixed support system is either diffuse, in which case a random request exposes many disjoint dependencies, or hub-concentrated, in which case the hub supplies only a short global sketch and the remaining information is dispersed across small residual groups. Random incidence defeats both geometries.</w:t>
+      </w:r>
+    </w:p>
+    <w:p>
+      <w:pPr>
+        <w:pStyle w:val="BodyText"/>
+      </w:pPr>
+      <w:r>
+        <w:t xml:space="preserve">The remaining frontier is correspondingly precise. To beat the random-family barrier with two writes, an unrestricted representation must exploit support motion strongly enough to maintain high-influence hubs while changing which physical cells play that role across states. Whether such moving geometry can actually yield</w:t>
+      </w:r>
+      <w:r>
+        <w:t xml:space="preserve"> </w:t>
+      </w:r>
+      <m:oMath>
+        <m:r>
+          <m:t>q</m:t>
+        </m:r>
+        <m:r>
+          <m:rPr>
+            <m:sty m:val="p"/>
+          </m:rPr>
+          <m:t>=</m:t>
+        </m:r>
+        <m:r>
+          <m:t>o</m:t>
+        </m:r>
+        <m:d>
+          <m:dPr>
+            <m:begChr m:val="("/>
+            <m:endChr m:val=")"/>
+            <m:sepChr m:val=""/>
+            <m:grow/>
+          </m:dPr>
+          <m:e>
+            <m:r>
+              <m:t>w</m:t>
+            </m:r>
+          </m:e>
+        </m:d>
+      </m:oMath>
+      <w:r>
         <w:t xml:space="preserve"> </w:t>
       </w:r>
       <w:r>
         <w:t xml:space="preserve">is the central open problem.</w:t>
       </w:r>
     </w:p>
-    <w:bookmarkEnd w:id="69"/>
-    <w:bookmarkStart w:id="70" w:name="X62bfed4655fee1c3dc86dc61921cccc388eda1c"/>
+    <w:bookmarkEnd w:id="70"/>
+    <w:bookmarkStart w:id="71" w:name="X62bfed4655fee1c3dc86dc61921cccc388eda1c"/>
     <w:p>
       <w:pPr>
         <w:pStyle w:val="Heading1"/>
@@ -30127,8 +30989,8 @@
         <w:t xml:space="preserve">.</w:t>
       </w:r>
     </w:p>
-    <w:bookmarkEnd w:id="70"/>
-    <w:bookmarkStart w:id="71" w:name="appendix-b.-theorem-dependency-graph"/>
+    <w:bookmarkEnd w:id="71"/>
+    <w:bookmarkStart w:id="72" w:name="appendix-b.-theorem-dependency-graph"/>
     <w:p>
       <w:pPr>
         <w:pStyle w:val="Heading1"/>
@@ -30427,8 +31289,8 @@
         <w:t xml:space="preserve">        +-- q = Omega(w)</w:t>
       </w:r>
     </w:p>
-    <w:bookmarkEnd w:id="71"/>
-    <w:bookmarkStart w:id="72" w:name="Xff688fa616572ba2f60e03fc9756a114a3a5883"/>
+    <w:bookmarkEnd w:id="72"/>
+    <w:bookmarkStart w:id="73" w:name="Xff688fa616572ba2f60e03fc9756a114a3a5883"/>
     <w:p>
       <w:pPr>
         <w:pStyle w:val="Heading1"/>
@@ -30459,7 +31321,7 @@
         <w:rPr>
           <w:rStyle w:val="VerbatimChar"/>
         </w:rPr>
-        <w:t xml:space="preserve">fbdg_structured_validate.py</w:t>
+        <w:t xml:space="preserve">validation/fbdg_structured_validate.py</w:t>
       </w:r>
       <w:r>
         <w:t xml:space="preserve"> </w:t>
@@ -31095,11 +31957,58 @@
         <w:pStyle w:val="BodyText"/>
       </w:pPr>
       <w:r>
+        <w:t xml:space="preserve">The exact retained stdout is stored in</w:t>
+      </w:r>
+      <w:r>
+        <w:t xml:space="preserve"> </w:t>
+      </w:r>
+      <w:r>
+        <w:rPr>
+          <w:rStyle w:val="VerbatimChar"/>
+        </w:rPr>
+        <w:t xml:space="preserve">validation/EXPECTED_OUTPUT.txt</w:t>
+      </w:r>
+      <w:r>
+        <w:t xml:space="preserve">. Its SHA-256 is</w:t>
+      </w:r>
+      <w:r>
+        <w:t xml:space="preserve"> </w:t>
+      </w:r>
+      <w:r>
+        <w:rPr>
+          <w:rStyle w:val="VerbatimChar"/>
+        </w:rPr>
+        <w:t xml:space="preserve">3f4cf123386c0239858e0ef597a91b4650574447c7a5a0a77b1788ab2c242012</w:t>
+      </w:r>
+      <w:r>
+        <w:t xml:space="preserve">.</w:t>
+      </w:r>
+      <w:r>
+        <w:t xml:space="preserve"> </w:t>
+      </w:r>
+      <w:r>
+        <w:rPr>
+          <w:rStyle w:val="VerbatimChar"/>
+        </w:rPr>
+        <w:t xml:space="preserve">validation/manifest.json</w:t>
+      </w:r>
+      <w:r>
+        <w:t xml:space="preserve"> </w:t>
+      </w:r>
+      <w:r>
+        <w:t xml:space="preserve">records the command, Python assumptions, expected counts, checksum, and validator Git-blob identity used when the reproducibility package was frozen on 2026-10-17. The repository CI reruns the validator and requires byte-for-byte agreement with the retained output.</w:t>
+      </w:r>
+    </w:p>
+    <w:p>
+      <w:pPr>
+        <w:pStyle w:val="BodyText"/>
+      </w:pPr>
+      <w:r>
         <w:t xml:space="preserve">These executions validate the finite implementation of the positive construction; they are not used as evidence for the asymptotic lower bound.</w:t>
       </w:r>
     </w:p>
-    <w:bookmarkEnd w:id="72"/>
-    <w:bookmarkStart w:id="73" w:name="appendix-d.-proof-repair-ledger"/>
+    <w:bookmarkEnd w:id="73"/>
+    <w:bookmarkStart w:id="74" w:name="appendix-d.-proof-repair-ledger"/>
     <w:p>
       <w:pPr>
         <w:pStyle w:val="Heading1"/>
@@ -31355,8 +32264,8 @@
         <w:t xml:space="preserve">Every use of static support geometry is explicit, and Section 10 isolates the precise boundary.</w:t>
       </w:r>
     </w:p>
-    <w:bookmarkEnd w:id="73"/>
-    <w:bookmarkStart w:id="105" w:name="references"/>
+    <w:bookmarkEnd w:id="74"/>
+    <w:bookmarkStart w:id="118" w:name="references"/>
     <w:p>
       <w:pPr>
         <w:pStyle w:val="Heading1"/>
@@ -31365,8 +32274,8 @@
         <w:t xml:space="preserve">References</w:t>
       </w:r>
     </w:p>
-    <w:bookmarkStart w:id="104" w:name="refs"/>
-    <w:bookmarkStart w:id="75" w:name="ref-boruchovsky2026allsymbol"/>
+    <w:bookmarkStart w:id="117" w:name="refs"/>
+    <w:bookmarkStart w:id="76" w:name="ref-boruchovsky2026allsymbol"/>
     <w:p>
       <w:pPr>
         <w:pStyle w:val="Bibliography"/>
@@ -31402,7 +32311,7 @@
       <w:r>
         <w:t xml:space="preserve"> </w:t>
       </w:r>
-      <w:hyperlink r:id="rId74">
+      <w:hyperlink r:id="rId75">
         <w:r>
           <w:rPr>
             <w:rStyle w:val="Hyperlink"/>
@@ -31414,8 +32323,8 @@
         <w:t xml:space="preserve">.</w:t>
       </w:r>
     </w:p>
-    <w:bookmarkEnd w:id="75"/>
-    <w:bookmarkStart w:id="77" w:name="ref-chandran2014luldc"/>
+    <w:bookmarkEnd w:id="76"/>
+    <w:bookmarkStart w:id="78" w:name="ref-chandran2014luldc"/>
     <w:p>
       <w:pPr>
         <w:pStyle w:val="Bibliography"/>
@@ -31451,7 +32360,7 @@
       <w:r>
         <w:t xml:space="preserve"> </w:t>
       </w:r>
-      <w:hyperlink r:id="rId76">
+      <w:hyperlink r:id="rId77">
         <w:r>
           <w:rPr>
             <w:rStyle w:val="Hyperlink"/>
@@ -31463,8 +32372,8 @@
         <w:t xml:space="preserve">.</w:t>
       </w:r>
     </w:p>
-    <w:bookmarkEnd w:id="77"/>
-    <w:bookmarkStart w:id="79" w:name="ref-garg2026qws"/>
+    <w:bookmarkEnd w:id="78"/>
+    <w:bookmarkStart w:id="80" w:name="ref-garg2026qws"/>
     <w:p>
       <w:pPr>
         <w:pStyle w:val="Bibliography"/>
@@ -31506,7 +32415,7 @@
       <w:r>
         <w:t xml:space="preserve"> </w:t>
       </w:r>
-      <w:hyperlink r:id="rId78">
+      <w:hyperlink r:id="rId79">
         <w:r>
           <w:rPr>
             <w:rStyle w:val="Hyperlink"/>
@@ -31518,8 +32427,8 @@
         <w:t xml:space="preserve">.</w:t>
       </w:r>
     </w:p>
-    <w:bookmarkEnd w:id="79"/>
-    <w:bookmarkStart w:id="81" w:name="ref-ishai2004batch"/>
+    <w:bookmarkEnd w:id="80"/>
+    <w:bookmarkStart w:id="82" w:name="ref-ishai2004batch"/>
     <w:p>
       <w:pPr>
         <w:pStyle w:val="Bibliography"/>
@@ -31555,7 +32464,7 @@
       <w:r>
         <w:t xml:space="preserve"> </w:t>
       </w:r>
-      <w:hyperlink r:id="rId80">
+      <w:hyperlink r:id="rId81">
         <w:r>
           <w:rPr>
             <w:rStyle w:val="Hyperlink"/>
@@ -31567,285 +32476,57 @@
         <w:t xml:space="preserve">.</w:t>
       </w:r>
     </w:p>
-    <w:bookmarkEnd w:id="81"/>
-    <w:bookmarkStart w:id="83" w:name="ref-li2021improved"/>
+    <w:bookmarkEnd w:id="82"/>
+    <w:bookmarkStart w:id="84" w:name="ref-ko2025landscape"/>
     <w:p>
       <w:pPr>
         <w:pStyle w:val="Bibliography"/>
       </w:pPr>
       <w:r>
-        <w:t xml:space="preserve">Li, Ray, and Mary Wootters. 2021.</w:t>
-      </w:r>
-      <w:r>
-        <w:t xml:space="preserve"> </w:t>
-      </w:r>
-      <w:r>
-        <w:t xml:space="preserve">“Improved Batch Code Lower Bounds.”</w:t>
-      </w:r>
-      <w:r>
-        <w:t xml:space="preserve"> </w:t>
-      </w:r>
-      <w:hyperlink r:id="rId82">
+        <w:t xml:space="preserve">Ko, Young Kun. 2025.</w:t>
+      </w:r>
+      <w:r>
+        <w:t xml:space="preserve"> </w:t>
+      </w:r>
+      <w:r>
+        <w:t xml:space="preserve">“Unifying the Landscape of Super-Logarithmic Dynamic Cell-Probe Lower Bounds.”</w:t>
+      </w:r>
+      <w:r>
+        <w:t xml:space="preserve"> </w:t>
+      </w:r>
+      <w:hyperlink r:id="rId83">
         <w:r>
           <w:rPr>
             <w:rStyle w:val="Hyperlink"/>
           </w:rPr>
-          <w:t xml:space="preserve">https://arxiv.org/abs/2106.02163</w:t>
+          <w:t xml:space="preserve">https://arxiv.org/abs/2510.17717</w:t>
         </w:r>
       </w:hyperlink>
       <w:r>
         <w:t xml:space="preserve">.</w:t>
       </w:r>
     </w:p>
-    <w:bookmarkEnd w:id="83"/>
-    <w:bookmarkStart w:id="85" w:name="ref-maturana2021arbitrary"/>
+    <w:bookmarkEnd w:id="84"/>
+    <w:bookmarkStart w:id="86" w:name="ref-ko2026boolean"/>
     <w:p>
       <w:pPr>
         <w:pStyle w:val="Bibliography"/>
       </w:pPr>
       <w:r>
-        <w:t xml:space="preserve">Maturana, Francisco, and K. V. Rashmi. 2021.</w:t>
-      </w:r>
-      <w:r>
-        <w:t xml:space="preserve"> </w:t>
-      </w:r>
-      <w:r>
-        <w:t xml:space="preserve">“Irregular Array Codes with Arbitrary Access Sets for Geo-Distributed Storage.”</w:t>
-      </w:r>
-      <w:r>
-        <w:t xml:space="preserve"> </w:t>
-      </w:r>
-      <w:r>
-        <w:t xml:space="preserve">In</w:t>
-      </w:r>
-      <w:r>
-        <w:t xml:space="preserve"> </w:t>
-      </w:r>
-      <w:r>
-        <w:rPr>
-          <w:iCs/>
-          <w:i/>
-        </w:rPr>
-        <w:t xml:space="preserve">2021 IEEE International Symposium on Information Theory</w:t>
-      </w:r>
-      <w:r>
-        <w:t xml:space="preserve">, 3002–7.</w:t>
-      </w:r>
-      <w:r>
-        <w:t xml:space="preserve"> </w:t>
-      </w:r>
-      <w:hyperlink r:id="rId84">
-        <w:r>
-          <w:rPr>
-            <w:rStyle w:val="Hyperlink"/>
-          </w:rPr>
-          <w:t xml:space="preserve">https://doi.org/10.1109/ISIT45174.2021.9517809</w:t>
-        </w:r>
-      </w:hyperlink>
-      <w:r>
-        <w:t xml:space="preserve">.</w:t>
-      </w:r>
-    </w:p>
-    <w:bookmarkEnd w:id="85"/>
-    <w:bookmarkStart w:id="87" w:name="ref-mazumdar2013update"/>
-    <w:p>
-      <w:pPr>
-        <w:pStyle w:val="Bibliography"/>
-      </w:pPr>
-      <w:r>
-        <w:t xml:space="preserve">Mazumdar, Arya, Venkat Chandar, and Gregory W. Wornell. 2013.</w:t>
-      </w:r>
-      <w:r>
-        <w:t xml:space="preserve"> </w:t>
-      </w:r>
-      <w:r>
-        <w:t xml:space="preserve">“Update-Efficiency and Local Repairability Limits for Capacity Approaching Codes.”</w:t>
-      </w:r>
-      <w:r>
-        <w:t xml:space="preserve"> </w:t>
-      </w:r>
-      <w:hyperlink r:id="rId86">
-        <w:r>
-          <w:rPr>
-            <w:rStyle w:val="Hyperlink"/>
-          </w:rPr>
-          <w:t xml:space="preserve">https://arxiv.org/abs/1305.3224</w:t>
-        </w:r>
-      </w:hyperlink>
-      <w:r>
-        <w:t xml:space="preserve">.</w:t>
-      </w:r>
-    </w:p>
-    <w:bookmarkEnd w:id="87"/>
-    <w:bookmarkStart w:id="89" w:name="ref-oksner2026functional"/>
-    <w:p>
-      <w:pPr>
-        <w:pStyle w:val="Bibliography"/>
-      </w:pPr>
-      <w:r>
-        <w:t xml:space="preserve">Oksner, Kristiina, Henk D. L. Hollmann, Ago-Erik Riet, and Vitaly Skachek. 2026.</w:t>
-      </w:r>
-      <w:r>
-        <w:t xml:space="preserve"> </w:t>
-      </w:r>
-      <w:r>
-        <w:t xml:space="preserve">“On the Minimum Length of Functional Batch Codes with Small Recovery Sets.”</w:t>
-      </w:r>
-      <w:r>
-        <w:t xml:space="preserve"> </w:t>
-      </w:r>
-      <w:hyperlink r:id="rId88">
-        <w:r>
-          <w:rPr>
-            <w:rStyle w:val="Hyperlink"/>
-          </w:rPr>
-          <w:t xml:space="preserve">https://arxiv.org/abs/2601.12302</w:t>
-        </w:r>
-      </w:hyperlink>
-      <w:r>
-        <w:t xml:space="preserve">.</w:t>
-      </w:r>
-    </w:p>
-    <w:bookmarkEnd w:id="89"/>
-    <w:bookmarkStart w:id="91" w:name="ref-paterson2009cbc"/>
-    <w:p>
-      <w:pPr>
-        <w:pStyle w:val="Bibliography"/>
-      </w:pPr>
-      <w:r>
-        <w:t xml:space="preserve">Paterson, M. B., D. R. Stinson, and R. Wei. 2009.</w:t>
-      </w:r>
-      <w:r>
-        <w:t xml:space="preserve"> </w:t>
-      </w:r>
-      <w:r>
-        <w:t xml:space="preserve">“Combinatorial Batch Codes.”</w:t>
-      </w:r>
-      <w:r>
-        <w:t xml:space="preserve"> </w:t>
-      </w:r>
-      <w:r>
-        <w:rPr>
-          <w:iCs/>
-          <w:i/>
-        </w:rPr>
-        <w:t xml:space="preserve">Advances in Mathematics of Communications</w:t>
-      </w:r>
-      <w:r>
-        <w:t xml:space="preserve"> </w:t>
-      </w:r>
-      <w:r>
-        <w:t xml:space="preserve">3 (1): 13–27.</w:t>
-      </w:r>
-      <w:r>
-        <w:t xml:space="preserve"> </w:t>
-      </w:r>
-      <w:hyperlink r:id="rId90">
-        <w:r>
-          <w:rPr>
-            <w:rStyle w:val="Hyperlink"/>
-          </w:rPr>
-          <w:t xml:space="preserve">https://doi.org/10.3934/amc.2009.3.13</w:t>
-        </w:r>
-      </w:hyperlink>
-      <w:r>
-        <w:t xml:space="preserve">.</w:t>
-      </w:r>
-    </w:p>
-    <w:bookmarkEnd w:id="91"/>
-    <w:bookmarkStart w:id="93" w:name="ref-rawat2016batchgraphs"/>
-    <w:p>
-      <w:pPr>
-        <w:pStyle w:val="Bibliography"/>
-      </w:pPr>
-      <w:r>
-        <w:t xml:space="preserve">Rawat, Ankit Singh, Zhao Song, Alexandros G. Dimakis, and Anna Gál. 2016.</w:t>
-      </w:r>
-      <w:r>
-        <w:t xml:space="preserve"> </w:t>
-      </w:r>
-      <w:r>
-        <w:t xml:space="preserve">“Batch Codes Through Dense Graphs Without Short Cycles.”</w:t>
-      </w:r>
-      <w:r>
-        <w:t xml:space="preserve"> </w:t>
-      </w:r>
-      <w:r>
-        <w:rPr>
-          <w:iCs/>
-          <w:i/>
-        </w:rPr>
-        <w:t xml:space="preserve">IEEE Transactions on Information Theory</w:t>
-      </w:r>
-      <w:r>
-        <w:t xml:space="preserve"> </w:t>
-      </w:r>
-      <w:r>
-        <w:t xml:space="preserve">62 (4): 1592–1604.</w:t>
-      </w:r>
-      <w:r>
-        <w:t xml:space="preserve"> </w:t>
-      </w:r>
-      <w:hyperlink r:id="rId92">
-        <w:r>
-          <w:rPr>
-            <w:rStyle w:val="Hyperlink"/>
-          </w:rPr>
-          <w:t xml:space="preserve">https://doi.org/10.1109/TIT.2016.2524007</w:t>
-        </w:r>
-      </w:hyperlink>
-      <w:r>
-        <w:t xml:space="preserve">.</w:t>
-      </w:r>
-    </w:p>
-    <w:bookmarkEnd w:id="93"/>
-    <w:bookmarkStart w:id="95" w:name="ref-thomas2017restricted"/>
-    <w:p>
-      <w:pPr>
-        <w:pStyle w:val="Bibliography"/>
-      </w:pPr>
-      <w:r>
-        <w:t xml:space="preserve">Thomas, Eldho K., and Vitaly Skachek. 2017.</w:t>
-      </w:r>
-      <w:r>
-        <w:t xml:space="preserve"> </w:t>
-      </w:r>
-      <w:r>
-        <w:t xml:space="preserve">“Explicit Constructions and Bounds for Batch Codes with Restricted Size of Reconstruction Sets.”</w:t>
-      </w:r>
-      <w:r>
-        <w:t xml:space="preserve"> </w:t>
-      </w:r>
-      <w:hyperlink r:id="rId94">
-        <w:r>
-          <w:rPr>
-            <w:rStyle w:val="Hyperlink"/>
-          </w:rPr>
-          <w:t xml:space="preserve">https://arxiv.org/abs/1701.07579</w:t>
-        </w:r>
-      </w:hyperlink>
-      <w:r>
-        <w:t xml:space="preserve">.</w:t>
-      </w:r>
-    </w:p>
-    <w:bookmarkEnd w:id="95"/>
-    <w:bookmarkStart w:id="97" w:name="ref-vatedka2020worstcase"/>
-    <w:p>
-      <w:pPr>
-        <w:pStyle w:val="Bibliography"/>
-      </w:pPr>
-      <w:r>
-        <w:t xml:space="preserve">Vatedka, Shashank, Venkat Chandar, and Aslan Tchamkerten. 2020.</w:t>
-      </w:r>
-      <w:r>
-        <w:t xml:space="preserve"> </w:t>
-      </w:r>
-      <w:r>
-        <w:t xml:space="preserve">“</w:t>
-      </w:r>
-      <m:oMath>
-        <m:r>
-          <m:t>O</m:t>
+        <w:t xml:space="preserve">———. 2026a.</w:t>
+      </w:r>
+      <w:r>
+        <w:t xml:space="preserve"> </w:t>
+      </w:r>
+      <w:r>
+        <w:t xml:space="preserve">“An</w:t>
+      </w:r>
+      <w:r>
+        <w:t xml:space="preserve"> </w:t>
+      </w:r>
+      <m:oMath>
+        <m:r>
+          <m:t>Ω</m:t>
         </m:r>
         <m:d>
           <m:dPr>
@@ -31855,6 +32536,608 @@
             <m:grow/>
           </m:dPr>
           <m:e>
+            <m:sSup>
+              <m:e>
+                <m:d>
+                  <m:dPr>
+                    <m:begChr m:val="("/>
+                    <m:endChr m:val=")"/>
+                    <m:sepChr m:val=""/>
+                    <m:grow/>
+                  </m:dPr>
+                  <m:e>
+                    <m:r>
+                      <m:rPr>
+                        <m:sty m:val="p"/>
+                      </m:rPr>
+                      <m:t>log</m:t>
+                    </m:r>
+                    <m:r>
+                      <m:t>n</m:t>
+                    </m:r>
+                    <m:r>
+                      <m:rPr>
+                        <m:sty m:val="p"/>
+                      </m:rPr>
+                      <m:t>/</m:t>
+                    </m:r>
+                    <m:r>
+                      <m:rPr>
+                        <m:sty m:val="p"/>
+                      </m:rPr>
+                      <m:t>log</m:t>
+                    </m:r>
+                    <m:r>
+                      <m:rPr>
+                        <m:sty m:val="p"/>
+                      </m:rPr>
+                      <m:t>log</m:t>
+                    </m:r>
+                    <m:r>
+                      <m:t>n</m:t>
+                    </m:r>
+                  </m:e>
+                </m:d>
+              </m:e>
+              <m:sup>
+                <m:r>
+                  <m:t>2</m:t>
+                </m:r>
+              </m:sup>
+            </m:sSup>
+          </m:e>
+        </m:d>
+      </m:oMath>
+      <w:r>
+        <w:t xml:space="preserve"> </w:t>
+      </w:r>
+      <w:r>
+        <w:t xml:space="preserve">Cell-Probe Lower Bound for Dynamic Boolean Data Structures.”</w:t>
+      </w:r>
+      <w:r>
+        <w:t xml:space="preserve"> </w:t>
+      </w:r>
+      <w:hyperlink r:id="rId85">
+        <w:r>
+          <w:rPr>
+            <w:rStyle w:val="Hyperlink"/>
+          </w:rPr>
+          <w:t xml:space="preserve">https://arxiv.org/abs/2603.25914</w:t>
+        </w:r>
+      </w:hyperlink>
+      <w:r>
+        <w:t xml:space="preserve">.</w:t>
+      </w:r>
+    </w:p>
+    <w:bookmarkEnd w:id="86"/>
+    <w:bookmarkStart w:id="88" w:name="ref-ko2026dynamicgraphs"/>
+    <w:p>
+      <w:pPr>
+        <w:pStyle w:val="Bibliography"/>
+      </w:pPr>
+      <w:r>
+        <w:t xml:space="preserve">———. 2026b.</w:t>
+      </w:r>
+      <w:r>
+        <w:t xml:space="preserve"> </w:t>
+      </w:r>
+      <w:r>
+        <w:t xml:space="preserve">“</w:t>
+      </w:r>
+      <m:oMath>
+        <m:r>
+          <m:t>Ω</m:t>
+        </m:r>
+        <m:d>
+          <m:dPr>
+            <m:begChr m:val="("/>
+            <m:endChr m:val=")"/>
+            <m:sepChr m:val=""/>
+            <m:grow/>
+          </m:dPr>
+          <m:e>
+            <m:sSup>
+              <m:e>
+                <m:d>
+                  <m:dPr>
+                    <m:begChr m:val="("/>
+                    <m:endChr m:val=")"/>
+                    <m:sepChr m:val=""/>
+                    <m:grow/>
+                  </m:dPr>
+                  <m:e>
+                    <m:r>
+                      <m:rPr>
+                        <m:sty m:val="p"/>
+                      </m:rPr>
+                      <m:t>log</m:t>
+                    </m:r>
+                    <m:r>
+                      <m:t>n</m:t>
+                    </m:r>
+                    <m:r>
+                      <m:rPr>
+                        <m:sty m:val="p"/>
+                      </m:rPr>
+                      <m:t>/</m:t>
+                    </m:r>
+                    <m:r>
+                      <m:rPr>
+                        <m:sty m:val="p"/>
+                      </m:rPr>
+                      <m:t>log</m:t>
+                    </m:r>
+                    <m:r>
+                      <m:rPr>
+                        <m:sty m:val="p"/>
+                      </m:rPr>
+                      <m:t>log</m:t>
+                    </m:r>
+                    <m:r>
+                      <m:t>n</m:t>
+                    </m:r>
+                  </m:e>
+                </m:d>
+              </m:e>
+              <m:sup>
+                <m:r>
+                  <m:t>2</m:t>
+                </m:r>
+              </m:sup>
+            </m:sSup>
+          </m:e>
+        </m:d>
+      </m:oMath>
+      <w:r>
+        <w:t xml:space="preserve"> </w:t>
+      </w:r>
+      <w:r>
+        <w:t xml:space="preserve">Lower Bounds for Dynamic Graph Problems.”</w:t>
+      </w:r>
+      <w:r>
+        <w:t xml:space="preserve"> </w:t>
+      </w:r>
+      <w:hyperlink r:id="rId87">
+        <w:r>
+          <w:rPr>
+            <w:rStyle w:val="Hyperlink"/>
+          </w:rPr>
+          <w:t xml:space="preserve">https://arxiv.org/abs/2610.10904</w:t>
+        </w:r>
+      </w:hyperlink>
+      <w:r>
+        <w:t xml:space="preserve">.</w:t>
+      </w:r>
+    </w:p>
+    <w:bookmarkEnd w:id="88"/>
+    <w:bookmarkStart w:id="90" w:name="ref-larsen2020boolean"/>
+    <w:p>
+      <w:pPr>
+        <w:pStyle w:val="Bibliography"/>
+      </w:pPr>
+      <w:r>
+        <w:t xml:space="preserve">Larsen, Kasper Green, Omri Weinstein, and Huacheng Yu. 2020.</w:t>
+      </w:r>
+      <w:r>
+        <w:t xml:space="preserve"> </w:t>
+      </w:r>
+      <w:r>
+        <w:t xml:space="preserve">“Crossing the Logarithmic Barrier for Dynamic Boolean Data Structure Lower Bounds.”</w:t>
+      </w:r>
+      <w:r>
+        <w:t xml:space="preserve"> </w:t>
+      </w:r>
+      <w:r>
+        <w:rPr>
+          <w:iCs/>
+          <w:i/>
+        </w:rPr>
+        <w:t xml:space="preserve">SIAM Journal on Computing</w:t>
+      </w:r>
+      <w:r>
+        <w:t xml:space="preserve"> </w:t>
+      </w:r>
+      <w:r>
+        <w:t xml:space="preserve">49.</w:t>
+      </w:r>
+      <w:r>
+        <w:t xml:space="preserve"> </w:t>
+      </w:r>
+      <w:hyperlink r:id="rId89">
+        <w:r>
+          <w:rPr>
+            <w:rStyle w:val="Hyperlink"/>
+          </w:rPr>
+          <w:t xml:space="preserve">https://doi.org/10.1137/18M1198429</w:t>
+        </w:r>
+      </w:hyperlink>
+      <w:r>
+        <w:t xml:space="preserve">.</w:t>
+      </w:r>
+    </w:p>
+    <w:bookmarkEnd w:id="90"/>
+    <w:bookmarkStart w:id="92" w:name="ref-larsen2026dynamicgraphs"/>
+    <w:p>
+      <w:pPr>
+        <w:pStyle w:val="Bibliography"/>
+      </w:pPr>
+      <w:r>
+        <w:t xml:space="preserve">Larsen, Kasper Green, and Huacheng Yu. 2026.</w:t>
+      </w:r>
+      <w:r>
+        <w:t xml:space="preserve"> </w:t>
+      </w:r>
+      <w:r>
+        <w:t xml:space="preserve">“Super-Logarithmic Lower Bounds for Dynamic Graph Problems.”</w:t>
+      </w:r>
+      <w:r>
+        <w:t xml:space="preserve"> </w:t>
+      </w:r>
+      <w:r>
+        <w:rPr>
+          <w:iCs/>
+          <w:i/>
+        </w:rPr>
+        <w:t xml:space="preserve">SIAM Journal on Computing</w:t>
+      </w:r>
+      <w:r>
+        <w:t xml:space="preserve"> </w:t>
+      </w:r>
+      <w:r>
+        <w:t xml:space="preserve">55 (3): FOCS23-42-FOCS23-69.</w:t>
+      </w:r>
+      <w:r>
+        <w:t xml:space="preserve"> </w:t>
+      </w:r>
+      <w:hyperlink r:id="rId91">
+        <w:r>
+          <w:rPr>
+            <w:rStyle w:val="Hyperlink"/>
+          </w:rPr>
+          <w:t xml:space="preserve">https://doi.org/10.1137/24M1638215</w:t>
+        </w:r>
+      </w:hyperlink>
+      <w:r>
+        <w:t xml:space="preserve">.</w:t>
+      </w:r>
+    </w:p>
+    <w:bookmarkEnd w:id="92"/>
+    <w:bookmarkStart w:id="94" w:name="ref-li2021improved"/>
+    <w:p>
+      <w:pPr>
+        <w:pStyle w:val="Bibliography"/>
+      </w:pPr>
+      <w:r>
+        <w:t xml:space="preserve">Li, Ray, and Mary Wootters. 2021.</w:t>
+      </w:r>
+      <w:r>
+        <w:t xml:space="preserve"> </w:t>
+      </w:r>
+      <w:r>
+        <w:t xml:space="preserve">“Improved Batch Code Lower Bounds.”</w:t>
+      </w:r>
+      <w:r>
+        <w:t xml:space="preserve"> </w:t>
+      </w:r>
+      <w:hyperlink r:id="rId93">
+        <w:r>
+          <w:rPr>
+            <w:rStyle w:val="Hyperlink"/>
+          </w:rPr>
+          <w:t xml:space="preserve">https://arxiv.org/abs/2106.02163</w:t>
+        </w:r>
+      </w:hyperlink>
+      <w:r>
+        <w:t xml:space="preserve">.</w:t>
+      </w:r>
+    </w:p>
+    <w:bookmarkEnd w:id="94"/>
+    <w:bookmarkStart w:id="96" w:name="ref-maturana2021arbitrary"/>
+    <w:p>
+      <w:pPr>
+        <w:pStyle w:val="Bibliography"/>
+      </w:pPr>
+      <w:r>
+        <w:t xml:space="preserve">Maturana, Francisco, and K. V. Rashmi. 2021.</w:t>
+      </w:r>
+      <w:r>
+        <w:t xml:space="preserve"> </w:t>
+      </w:r>
+      <w:r>
+        <w:t xml:space="preserve">“Irregular Array Codes with Arbitrary Access Sets for Geo-Distributed Storage.”</w:t>
+      </w:r>
+      <w:r>
+        <w:t xml:space="preserve"> </w:t>
+      </w:r>
+      <w:r>
+        <w:t xml:space="preserve">In</w:t>
+      </w:r>
+      <w:r>
+        <w:t xml:space="preserve"> </w:t>
+      </w:r>
+      <w:r>
+        <w:rPr>
+          <w:iCs/>
+          <w:i/>
+        </w:rPr>
+        <w:t xml:space="preserve">2021 IEEE International Symposium on Information Theory</w:t>
+      </w:r>
+      <w:r>
+        <w:t xml:space="preserve">, 3002–7.</w:t>
+      </w:r>
+      <w:r>
+        <w:t xml:space="preserve"> </w:t>
+      </w:r>
+      <w:hyperlink r:id="rId95">
+        <w:r>
+          <w:rPr>
+            <w:rStyle w:val="Hyperlink"/>
+          </w:rPr>
+          <w:t xml:space="preserve">https://doi.org/10.1109/ISIT45174.2021.9517809</w:t>
+        </w:r>
+      </w:hyperlink>
+      <w:r>
+        <w:t xml:space="preserve">.</w:t>
+      </w:r>
+    </w:p>
+    <w:bookmarkEnd w:id="96"/>
+    <w:bookmarkStart w:id="98" w:name="ref-mazumdar2013update"/>
+    <w:p>
+      <w:pPr>
+        <w:pStyle w:val="Bibliography"/>
+      </w:pPr>
+      <w:r>
+        <w:t xml:space="preserve">Mazumdar, Arya, Venkat Chandar, and Gregory W. Wornell. 2013.</w:t>
+      </w:r>
+      <w:r>
+        <w:t xml:space="preserve"> </w:t>
+      </w:r>
+      <w:r>
+        <w:t xml:space="preserve">“Update-Efficiency and Local Repairability Limits for Capacity Approaching Codes.”</w:t>
+      </w:r>
+      <w:r>
+        <w:t xml:space="preserve"> </w:t>
+      </w:r>
+      <w:hyperlink r:id="rId97">
+        <w:r>
+          <w:rPr>
+            <w:rStyle w:val="Hyperlink"/>
+          </w:rPr>
+          <w:t xml:space="preserve">https://arxiv.org/abs/1305.3224</w:t>
+        </w:r>
+      </w:hyperlink>
+      <w:r>
+        <w:t xml:space="preserve">.</w:t>
+      </w:r>
+    </w:p>
+    <w:bookmarkEnd w:id="98"/>
+    <w:bookmarkStart w:id="100" w:name="ref-oksner2026functional"/>
+    <w:p>
+      <w:pPr>
+        <w:pStyle w:val="Bibliography"/>
+      </w:pPr>
+      <w:r>
+        <w:t xml:space="preserve">Oksner, Kristiina, Henk D. L. Hollmann, Ago-Erik Riet, and Vitaly Skachek. 2026.</w:t>
+      </w:r>
+      <w:r>
+        <w:t xml:space="preserve"> </w:t>
+      </w:r>
+      <w:r>
+        <w:t xml:space="preserve">“On the Minimum Length of Functional Batch Codes with Small Recovery Sets.”</w:t>
+      </w:r>
+      <w:r>
+        <w:t xml:space="preserve"> </w:t>
+      </w:r>
+      <w:hyperlink r:id="rId99">
+        <w:r>
+          <w:rPr>
+            <w:rStyle w:val="Hyperlink"/>
+          </w:rPr>
+          <w:t xml:space="preserve">https://arxiv.org/abs/2601.12302</w:t>
+        </w:r>
+      </w:hyperlink>
+      <w:r>
+        <w:t xml:space="preserve">.</w:t>
+      </w:r>
+    </w:p>
+    <w:bookmarkEnd w:id="100"/>
+    <w:bookmarkStart w:id="102" w:name="ref-paterson2009cbc"/>
+    <w:p>
+      <w:pPr>
+        <w:pStyle w:val="Bibliography"/>
+      </w:pPr>
+      <w:r>
+        <w:t xml:space="preserve">Paterson, M. B., D. R. Stinson, and R. Wei. 2009.</w:t>
+      </w:r>
+      <w:r>
+        <w:t xml:space="preserve"> </w:t>
+      </w:r>
+      <w:r>
+        <w:t xml:space="preserve">“Combinatorial Batch Codes.”</w:t>
+      </w:r>
+      <w:r>
+        <w:t xml:space="preserve"> </w:t>
+      </w:r>
+      <w:r>
+        <w:rPr>
+          <w:iCs/>
+          <w:i/>
+        </w:rPr>
+        <w:t xml:space="preserve">Advances in Mathematics of Communications</w:t>
+      </w:r>
+      <w:r>
+        <w:t xml:space="preserve"> </w:t>
+      </w:r>
+      <w:r>
+        <w:t xml:space="preserve">3 (1): 13–27.</w:t>
+      </w:r>
+      <w:r>
+        <w:t xml:space="preserve"> </w:t>
+      </w:r>
+      <w:hyperlink r:id="rId101">
+        <w:r>
+          <w:rPr>
+            <w:rStyle w:val="Hyperlink"/>
+          </w:rPr>
+          <w:t xml:space="preserve">https://doi.org/10.3934/amc.2009.3.13</w:t>
+        </w:r>
+      </w:hyperlink>
+      <w:r>
+        <w:t xml:space="preserve">.</w:t>
+      </w:r>
+    </w:p>
+    <w:bookmarkEnd w:id="102"/>
+    <w:bookmarkStart w:id="104" w:name="ref-patrascu2010multiphase"/>
+    <w:p>
+      <w:pPr>
+        <w:pStyle w:val="Bibliography"/>
+      </w:pPr>
+      <w:r>
+        <w:t xml:space="preserve">Pătraşcu, Mihai. 2010.</w:t>
+      </w:r>
+      <w:r>
+        <w:t xml:space="preserve"> </w:t>
+      </w:r>
+      <w:r>
+        <w:t xml:space="preserve">“Towards Polynomial Lower Bounds for Dynamic Problems.”</w:t>
+      </w:r>
+      <w:r>
+        <w:t xml:space="preserve"> </w:t>
+      </w:r>
+      <w:r>
+        <w:t xml:space="preserve">In</w:t>
+      </w:r>
+      <w:r>
+        <w:t xml:space="preserve"> </w:t>
+      </w:r>
+      <w:r>
+        <w:rPr>
+          <w:iCs/>
+          <w:i/>
+        </w:rPr>
+        <w:t xml:space="preserve">Proceedings of the 42nd ACM Symposium on Theory of Computing</w:t>
+      </w:r>
+      <w:r>
+        <w:t xml:space="preserve">, 603–10.</w:t>
+      </w:r>
+      <w:r>
+        <w:t xml:space="preserve"> </w:t>
+      </w:r>
+      <w:hyperlink r:id="rId103">
+        <w:r>
+          <w:rPr>
+            <w:rStyle w:val="Hyperlink"/>
+          </w:rPr>
+          <w:t xml:space="preserve">https://doi.org/10.1145/1806689.1806772</w:t>
+        </w:r>
+      </w:hyperlink>
+      <w:r>
+        <w:t xml:space="preserve">.</w:t>
+      </w:r>
+    </w:p>
+    <w:bookmarkEnd w:id="104"/>
+    <w:bookmarkStart w:id="106" w:name="ref-rawat2016batchgraphs"/>
+    <w:p>
+      <w:pPr>
+        <w:pStyle w:val="Bibliography"/>
+      </w:pPr>
+      <w:r>
+        <w:t xml:space="preserve">Rawat, Ankit Singh, Zhao Song, Alexandros G. Dimakis, and Anna Gál. 2016.</w:t>
+      </w:r>
+      <w:r>
+        <w:t xml:space="preserve"> </w:t>
+      </w:r>
+      <w:r>
+        <w:t xml:space="preserve">“Batch Codes Through Dense Graphs Without Short Cycles.”</w:t>
+      </w:r>
+      <w:r>
+        <w:t xml:space="preserve"> </w:t>
+      </w:r>
+      <w:r>
+        <w:rPr>
+          <w:iCs/>
+          <w:i/>
+        </w:rPr>
+        <w:t xml:space="preserve">IEEE Transactions on Information Theory</w:t>
+      </w:r>
+      <w:r>
+        <w:t xml:space="preserve"> </w:t>
+      </w:r>
+      <w:r>
+        <w:t xml:space="preserve">62 (4): 1592–1604.</w:t>
+      </w:r>
+      <w:r>
+        <w:t xml:space="preserve"> </w:t>
+      </w:r>
+      <w:hyperlink r:id="rId105">
+        <w:r>
+          <w:rPr>
+            <w:rStyle w:val="Hyperlink"/>
+          </w:rPr>
+          <w:t xml:space="preserve">https://doi.org/10.1109/TIT.2016.2524007</w:t>
+        </w:r>
+      </w:hyperlink>
+      <w:r>
+        <w:t xml:space="preserve">.</w:t>
+      </w:r>
+    </w:p>
+    <w:bookmarkEnd w:id="106"/>
+    <w:bookmarkStart w:id="108" w:name="ref-thomas2017restricted"/>
+    <w:p>
+      <w:pPr>
+        <w:pStyle w:val="Bibliography"/>
+      </w:pPr>
+      <w:r>
+        <w:t xml:space="preserve">Thomas, Eldho K., and Vitaly Skachek. 2017.</w:t>
+      </w:r>
+      <w:r>
+        <w:t xml:space="preserve"> </w:t>
+      </w:r>
+      <w:r>
+        <w:t xml:space="preserve">“Explicit Constructions and Bounds for Batch Codes with Restricted Size of Reconstruction Sets.”</w:t>
+      </w:r>
+      <w:r>
+        <w:t xml:space="preserve"> </w:t>
+      </w:r>
+      <w:hyperlink r:id="rId107">
+        <w:r>
+          <w:rPr>
+            <w:rStyle w:val="Hyperlink"/>
+          </w:rPr>
+          <w:t xml:space="preserve">https://arxiv.org/abs/1701.07579</w:t>
+        </w:r>
+      </w:hyperlink>
+      <w:r>
+        <w:t xml:space="preserve">.</w:t>
+      </w:r>
+    </w:p>
+    <w:bookmarkEnd w:id="108"/>
+    <w:bookmarkStart w:id="110" w:name="ref-vatedka2020worstcase"/>
+    <w:p>
+      <w:pPr>
+        <w:pStyle w:val="Bibliography"/>
+      </w:pPr>
+      <w:r>
+        <w:t xml:space="preserve">Vatedka, Shashank, Venkat Chandar, and Aslan Tchamkerten. 2020.</w:t>
+      </w:r>
+      <w:r>
+        <w:t xml:space="preserve"> </w:t>
+      </w:r>
+      <w:r>
+        <w:t xml:space="preserve">“</w:t>
+      </w:r>
+      <m:oMath>
+        <m:r>
+          <m:t>O</m:t>
+        </m:r>
+        <m:d>
+          <m:dPr>
+            <m:begChr m:val="("/>
+            <m:endChr m:val=")"/>
+            <m:sepChr m:val=""/>
+            <m:grow/>
+          </m:dPr>
+          <m:e>
             <m:r>
               <m:rPr>
                 <m:sty m:val="p"/>
@@ -31901,7 +33184,7 @@
       <w:r>
         <w:t xml:space="preserve"> </w:t>
       </w:r>
-      <w:hyperlink r:id="rId96">
+      <w:hyperlink r:id="rId109">
         <w:r>
           <w:rPr>
             <w:rStyle w:val="Hyperlink"/>
@@ -31913,8 +33196,8 @@
         <w:t xml:space="preserve">.</w:t>
       </w:r>
     </w:p>
-    <w:bookmarkEnd w:id="97"/>
-    <w:bookmarkStart w:id="99" w:name="ref-vatedka2020bigdata"/>
+    <w:bookmarkEnd w:id="110"/>
+    <w:bookmarkStart w:id="112" w:name="ref-vatedka2020bigdata"/>
     <w:p>
       <w:pPr>
         <w:pStyle w:val="Bibliography"/>
@@ -31947,7 +33230,7 @@
       <w:r>
         <w:t xml:space="preserve"> </w:t>
       </w:r>
-      <w:hyperlink r:id="rId98">
+      <w:hyperlink r:id="rId111">
         <w:r>
           <w:rPr>
             <w:rStyle w:val="Hyperlink"/>
@@ -31959,8 +33242,8 @@
         <w:t xml:space="preserve">.</w:t>
       </w:r>
     </w:p>
-    <w:bookmarkEnd w:id="99"/>
-    <w:bookmarkStart w:id="101" w:name="ref-zhang2015restricted"/>
+    <w:bookmarkEnd w:id="112"/>
+    <w:bookmarkStart w:id="114" w:name="ref-zhang2015restricted"/>
     <w:p>
       <w:pPr>
         <w:pStyle w:val="Bibliography"/>
@@ -31977,7 +33260,7 @@
       <w:r>
         <w:t xml:space="preserve"> </w:t>
       </w:r>
-      <w:hyperlink r:id="rId100">
+      <w:hyperlink r:id="rId113">
         <w:r>
           <w:rPr>
             <w:rStyle w:val="Hyperlink"/>
@@ -31989,8 +33272,8 @@
         <w:t xml:space="preserve">.</w:t>
       </w:r>
     </w:p>
-    <w:bookmarkEnd w:id="101"/>
-    <w:bookmarkStart w:id="103" w:name="ref-zhang2020functional"/>
+    <w:bookmarkEnd w:id="114"/>
+    <w:bookmarkStart w:id="116" w:name="ref-zhang2020functional"/>
     <w:p>
       <w:pPr>
         <w:pStyle w:val="Bibliography"/>
@@ -32023,7 +33306,7 @@
       <w:r>
         <w:t xml:space="preserve"> </w:t>
       </w:r>
-      <w:hyperlink r:id="rId102">
+      <w:hyperlink r:id="rId115">
         <w:r>
           <w:rPr>
             <w:rStyle w:val="Hyperlink"/>
@@ -32035,9 +33318,9 @@
         <w:t xml:space="preserve">.</w:t>
       </w:r>
     </w:p>
-    <w:bookmarkEnd w:id="103"/>
-    <w:bookmarkEnd w:id="104"/>
-    <w:bookmarkEnd w:id="105"/>
+    <w:bookmarkEnd w:id="116"/>
+    <w:bookmarkEnd w:id="117"/>
+    <w:bookmarkEnd w:id="118"/>
     <w:sectPr/>
   </w:body>
 </w:document>

</xml_diff>